<commit_message>
docs: apply professional refinements to hackathon word document
</commit_message>
<xml_diff>
--- a/RoadSOS_Hackathon_Details.docx
+++ b/RoadSOS_Hackathon_Details.docx
@@ -114,10 +114,10 @@
           <w:b/>
           <w:color w:val="4A777A"/>
         </w:rPr>
-        <w:t xml:space="preserve">Automated SOS &amp; Dispatch Coordinator: </w:t>
+        <w:t xml:space="preserve">SOS Assistance &amp; Emergency Coordination: </w:t>
       </w:r>
       <w:r>
-        <w:t>Facilitates instant emergency dispatches. Connects user request variables directly to the FastAPI database, matching seeded hospital providers and logging critical rescue coordinates dynamically.</w:t>
+        <w:t>Facilitates emergency requests by collecting incident details, identifying nearby emergency service providers, and helping users quickly access relevant assistance resources.</w:t>
       </w:r>
     </w:p>
     <w:p>
@@ -146,10 +146,10 @@
           <w:b/>
           <w:color w:val="4A777A"/>
         </w:rPr>
-        <w:t xml:space="preserve">Medical Profiles &amp; Family SOS Alerts: </w:t>
+        <w:t xml:space="preserve">Family SOS Alerts: </w:t>
       </w:r>
       <w:r>
-        <w:t>Integrates secure local schemas to manage key patient medical details and automatically coordinate twilio-based distress SMS alerts containing live location details directly to designated emergency contacts.</w:t>
+        <w:t>Supports emergency contact notifications through Twilio integration, enabling rapid communication during emergencies.</w:t>
       </w:r>
     </w:p>
     <w:p>
@@ -356,6 +356,83 @@
     </w:p>
     <w:p>
       <w:pPr>
+        <w:spacing w:before="280" w:after="120"/>
+      </w:pPr>
+      <w:r>
+        <w:rPr>
+          <w:b/>
+          <w:color w:val="1B365D"/>
+          <w:sz w:val="32"/>
+        </w:rPr>
+        <w:t>5. Development Tools</w:t>
+      </w:r>
+    </w:p>
+    <w:p>
+      <w:pPr>
+        <w:pStyle w:val="ListBullet"/>
+        <w:spacing w:after="80"/>
+      </w:pPr>
+      <w:r>
+        <w:rPr>
+          <w:b/>
+          <w:color w:val="4A777A"/>
+        </w:rPr>
+        <w:t xml:space="preserve">Git &amp; GitHub – </w:t>
+      </w:r>
+      <w:r>
+        <w:t>Version control and collaboration</w:t>
+      </w:r>
+    </w:p>
+    <w:p>
+      <w:pPr>
+        <w:pStyle w:val="ListBullet"/>
+        <w:spacing w:after="80"/>
+      </w:pPr>
+      <w:r>
+        <w:rPr>
+          <w:b/>
+          <w:color w:val="4A777A"/>
+        </w:rPr>
+        <w:t xml:space="preserve">Postman – </w:t>
+      </w:r>
+      <w:r>
+        <w:t>API testing and validation</w:t>
+      </w:r>
+    </w:p>
+    <w:p>
+      <w:pPr>
+        <w:pStyle w:val="ListBullet"/>
+        <w:spacing w:after="80"/>
+      </w:pPr>
+      <w:r>
+        <w:rPr>
+          <w:b/>
+          <w:color w:val="4A777A"/>
+        </w:rPr>
+        <w:t xml:space="preserve">Vercel – </w:t>
+      </w:r>
+      <w:r>
+        <w:t>Frontend deployment</w:t>
+      </w:r>
+    </w:p>
+    <w:p>
+      <w:pPr>
+        <w:pStyle w:val="ListBullet"/>
+        <w:spacing w:after="80"/>
+      </w:pPr>
+      <w:r>
+        <w:rPr>
+          <w:b/>
+          <w:color w:val="4A777A"/>
+        </w:rPr>
+        <w:t xml:space="preserve">Docker – </w:t>
+      </w:r>
+      <w:r>
+        <w:t>Containerization and deployment readiness</w:t>
+      </w:r>
+    </w:p>
+    <w:p>
+      <w:pPr>
         <w:spacing w:before="280" w:after="160"/>
       </w:pPr>
       <w:r>
@@ -364,7 +441,20 @@
           <w:color w:val="1B365D"/>
           <w:sz w:val="32"/>
         </w:rPr>
-        <w:t>5. Software Packages &amp; Dependencies</w:t>
+        <w:t>6. Software Packages &amp; Dependencies</w:t>
+      </w:r>
+    </w:p>
+    <w:p>
+      <w:pPr>
+        <w:spacing w:before="160" w:after="80"/>
+      </w:pPr>
+      <w:r>
+        <w:rPr>
+          <w:b/>
+          <w:color w:val="4A777A"/>
+          <w:sz w:val="26"/>
+        </w:rPr>
+        <w:t>6.1 Backend Packages</w:t>
       </w:r>
     </w:p>
     <w:tbl>
@@ -392,10 +482,10 @@
             <w:tcW w:type="dxa" w:w="3168"/>
             <w:shd w:fill="1B365D"/>
             <w:tcMar>
-              <w:top w:w="140" w:type="dxa"/>
-              <w:bottom w:w="140" w:type="dxa"/>
-              <w:left w:w="180" w:type="dxa"/>
-              <w:right w:w="180" w:type="dxa"/>
+              <w:top w:w="120" w:type="dxa"/>
+              <w:bottom w:w="120" w:type="dxa"/>
+              <w:left w:w="150" w:type="dxa"/>
+              <w:right w:w="150" w:type="dxa"/>
             </w:tcMar>
           </w:tcPr>
           <w:p>
@@ -405,7 +495,7 @@
                 <w:color w:val="FFFFFF"/>
                 <w:sz w:val="21"/>
               </w:rPr>
-              <w:t>Package / Library</w:t>
+              <w:t>Package</w:t>
             </w:r>
           </w:p>
         </w:tc>
@@ -414,10 +504,10 @@
             <w:tcW w:type="dxa" w:w="6192"/>
             <w:shd w:fill="1B365D"/>
             <w:tcMar>
-              <w:top w:w="140" w:type="dxa"/>
-              <w:bottom w:w="140" w:type="dxa"/>
-              <w:left w:w="180" w:type="dxa"/>
-              <w:right w:w="180" w:type="dxa"/>
+              <w:top w:w="120" w:type="dxa"/>
+              <w:bottom w:w="120" w:type="dxa"/>
+              <w:left w:w="150" w:type="dxa"/>
+              <w:right w:w="150" w:type="dxa"/>
             </w:tcMar>
           </w:tcPr>
           <w:p>
@@ -427,7 +517,7 @@
                 <w:color w:val="FFFFFF"/>
                 <w:sz w:val="21"/>
               </w:rPr>
-              <w:t>Actual Role in RoadSOS Platform</w:t>
+              <w:t>Purpose</w:t>
             </w:r>
           </w:p>
         </w:tc>
@@ -438,10 +528,10 @@
             <w:tcW w:type="dxa" w:w="3168"/>
             <w:shd w:fill="FFFFFF"/>
             <w:tcMar>
-              <w:top w:w="100" w:type="dxa"/>
-              <w:bottom w:w="100" w:type="dxa"/>
-              <w:left w:w="150" w:type="dxa"/>
-              <w:right w:w="150" w:type="dxa"/>
+              <w:top w:w="80" w:type="dxa"/>
+              <w:bottom w:w="80" w:type="dxa"/>
+              <w:left w:w="120" w:type="dxa"/>
+              <w:right w:w="120" w:type="dxa"/>
             </w:tcMar>
           </w:tcPr>
           <w:p>
@@ -450,7 +540,7 @@
                 <w:b/>
                 <w:sz w:val="19"/>
               </w:rPr>
-              <w:t>fastapi (0.111.0)</w:t>
+              <w:t>FastAPI</w:t>
             </w:r>
           </w:p>
         </w:tc>
@@ -459,10 +549,10 @@
             <w:tcW w:type="dxa" w:w="6192"/>
             <w:shd w:fill="FFFFFF"/>
             <w:tcMar>
-              <w:top w:w="100" w:type="dxa"/>
-              <w:bottom w:w="100" w:type="dxa"/>
-              <w:left w:w="150" w:type="dxa"/>
-              <w:right w:w="150" w:type="dxa"/>
+              <w:top w:w="80" w:type="dxa"/>
+              <w:bottom w:w="80" w:type="dxa"/>
+              <w:left w:w="120" w:type="dxa"/>
+              <w:right w:w="120" w:type="dxa"/>
             </w:tcMar>
           </w:tcPr>
           <w:p>
@@ -470,7 +560,7 @@
               <w:rPr>
                 <w:sz w:val="19"/>
               </w:rPr>
-              <w:t>High-performance web API framework with modern, type-checked Python routes.</w:t>
+              <w:t>REST APIs</w:t>
             </w:r>
           </w:p>
         </w:tc>
@@ -481,10 +571,10 @@
             <w:tcW w:type="dxa" w:w="3168"/>
             <w:shd w:fill="F4F6F9"/>
             <w:tcMar>
-              <w:top w:w="100" w:type="dxa"/>
-              <w:bottom w:w="100" w:type="dxa"/>
-              <w:left w:w="150" w:type="dxa"/>
-              <w:right w:w="150" w:type="dxa"/>
+              <w:top w:w="80" w:type="dxa"/>
+              <w:bottom w:w="80" w:type="dxa"/>
+              <w:left w:w="120" w:type="dxa"/>
+              <w:right w:w="120" w:type="dxa"/>
             </w:tcMar>
           </w:tcPr>
           <w:p>
@@ -493,7 +583,7 @@
                 <w:b/>
                 <w:sz w:val="19"/>
               </w:rPr>
-              <w:t>uvicorn (0.29.0)</w:t>
+              <w:t>Uvicorn</w:t>
             </w:r>
           </w:p>
         </w:tc>
@@ -502,10 +592,10 @@
             <w:tcW w:type="dxa" w:w="6192"/>
             <w:shd w:fill="F4F6F9"/>
             <w:tcMar>
-              <w:top w:w="100" w:type="dxa"/>
-              <w:bottom w:w="100" w:type="dxa"/>
-              <w:left w:w="150" w:type="dxa"/>
-              <w:right w:w="150" w:type="dxa"/>
+              <w:top w:w="80" w:type="dxa"/>
+              <w:bottom w:w="80" w:type="dxa"/>
+              <w:left w:w="120" w:type="dxa"/>
+              <w:right w:w="120" w:type="dxa"/>
             </w:tcMar>
           </w:tcPr>
           <w:p>
@@ -513,7 +603,7 @@
               <w:rPr>
                 <w:sz w:val="19"/>
               </w:rPr>
-              <w:t>Lightweight, lightning-fast ASGI server hosting the local backend pipeline.</w:t>
+              <w:t>ASGI Server</w:t>
             </w:r>
           </w:p>
         </w:tc>
@@ -524,10 +614,10 @@
             <w:tcW w:type="dxa" w:w="3168"/>
             <w:shd w:fill="FFFFFF"/>
             <w:tcMar>
-              <w:top w:w="100" w:type="dxa"/>
-              <w:bottom w:w="100" w:type="dxa"/>
-              <w:left w:w="150" w:type="dxa"/>
-              <w:right w:w="150" w:type="dxa"/>
+              <w:top w:w="80" w:type="dxa"/>
+              <w:bottom w:w="80" w:type="dxa"/>
+              <w:left w:w="120" w:type="dxa"/>
+              <w:right w:w="120" w:type="dxa"/>
             </w:tcMar>
           </w:tcPr>
           <w:p>
@@ -536,7 +626,7 @@
                 <w:b/>
                 <w:sz w:val="19"/>
               </w:rPr>
-              <w:t>pydantic[email] (&lt;2.0.0)</w:t>
+              <w:t>SQLAlchemy</w:t>
             </w:r>
           </w:p>
         </w:tc>
@@ -545,10 +635,10 @@
             <w:tcW w:type="dxa" w:w="6192"/>
             <w:shd w:fill="FFFFFF"/>
             <w:tcMar>
-              <w:top w:w="100" w:type="dxa"/>
-              <w:bottom w:w="100" w:type="dxa"/>
-              <w:left w:w="150" w:type="dxa"/>
-              <w:right w:w="150" w:type="dxa"/>
+              <w:top w:w="80" w:type="dxa"/>
+              <w:bottom w:w="80" w:type="dxa"/>
+              <w:left w:w="120" w:type="dxa"/>
+              <w:right w:w="120" w:type="dxa"/>
             </w:tcMar>
           </w:tcPr>
           <w:p>
@@ -556,7 +646,7 @@
               <w:rPr>
                 <w:sz w:val="19"/>
               </w:rPr>
-              <w:t>Handles data serialization, strict model validation, and user profile verification.</w:t>
+              <w:t>ORM</w:t>
             </w:r>
           </w:p>
         </w:tc>
@@ -567,53 +657,10 @@
             <w:tcW w:type="dxa" w:w="3168"/>
             <w:shd w:fill="F4F6F9"/>
             <w:tcMar>
-              <w:top w:w="100" w:type="dxa"/>
-              <w:bottom w:w="100" w:type="dxa"/>
-              <w:left w:w="150" w:type="dxa"/>
-              <w:right w:w="150" w:type="dxa"/>
-            </w:tcMar>
-          </w:tcPr>
-          <w:p>
-            <w:r>
-              <w:rPr>
-                <w:b/>
-                <w:sz w:val="19"/>
-              </w:rPr>
-              <w:t>sqlalchemy (&gt;=2.0.36)</w:t>
-            </w:r>
-          </w:p>
-        </w:tc>
-        <w:tc>
-          <w:tcPr>
-            <w:tcW w:type="dxa" w:w="6192"/>
-            <w:shd w:fill="F4F6F9"/>
-            <w:tcMar>
-              <w:top w:w="100" w:type="dxa"/>
-              <w:bottom w:w="100" w:type="dxa"/>
-              <w:left w:w="150" w:type="dxa"/>
-              <w:right w:w="150" w:type="dxa"/>
-            </w:tcMar>
-          </w:tcPr>
-          <w:p>
-            <w:r>
-              <w:rPr>
-                <w:sz w:val="19"/>
-              </w:rPr>
-              <w:t>Industry-standard ORM bridging clean transactional Python classes to relational queries.</w:t>
-            </w:r>
-          </w:p>
-        </w:tc>
-      </w:tr>
-      <w:tr>
-        <w:tc>
-          <w:tcPr>
-            <w:tcW w:type="dxa" w:w="3168"/>
-            <w:shd w:fill="FFFFFF"/>
-            <w:tcMar>
-              <w:top w:w="100" w:type="dxa"/>
-              <w:bottom w:w="100" w:type="dxa"/>
-              <w:left w:w="150" w:type="dxa"/>
-              <w:right w:w="150" w:type="dxa"/>
+              <w:top w:w="80" w:type="dxa"/>
+              <w:bottom w:w="80" w:type="dxa"/>
+              <w:left w:w="120" w:type="dxa"/>
+              <w:right w:w="120" w:type="dxa"/>
             </w:tcMar>
           </w:tcPr>
           <w:p>
@@ -629,12 +676,12 @@
         <w:tc>
           <w:tcPr>
             <w:tcW w:type="dxa" w:w="6192"/>
-            <w:shd w:fill="FFFFFF"/>
+            <w:shd w:fill="F4F6F9"/>
             <w:tcMar>
-              <w:top w:w="100" w:type="dxa"/>
-              <w:bottom w:w="100" w:type="dxa"/>
-              <w:left w:w="150" w:type="dxa"/>
-              <w:right w:w="150" w:type="dxa"/>
+              <w:top w:w="80" w:type="dxa"/>
+              <w:bottom w:w="80" w:type="dxa"/>
+              <w:left w:w="120" w:type="dxa"/>
+              <w:right w:w="120" w:type="dxa"/>
             </w:tcMar>
           </w:tcPr>
           <w:p>
@@ -642,7 +689,7 @@
               <w:rPr>
                 <w:sz w:val="19"/>
               </w:rPr>
-              <w:t>Asynchronous SQLite database adapter enabling non-blocking database queries.</w:t>
+              <w:t>Database</w:t>
             </w:r>
           </w:p>
         </w:tc>
@@ -651,12 +698,12 @@
         <w:tc>
           <w:tcPr>
             <w:tcW w:type="dxa" w:w="3168"/>
-            <w:shd w:fill="F4F6F9"/>
+            <w:shd w:fill="FFFFFF"/>
             <w:tcMar>
-              <w:top w:w="100" w:type="dxa"/>
-              <w:bottom w:w="100" w:type="dxa"/>
-              <w:left w:w="150" w:type="dxa"/>
-              <w:right w:w="150" w:type="dxa"/>
+              <w:top w:w="80" w:type="dxa"/>
+              <w:bottom w:w="80" w:type="dxa"/>
+              <w:left w:w="120" w:type="dxa"/>
+              <w:right w:w="120" w:type="dxa"/>
             </w:tcMar>
           </w:tcPr>
           <w:p>
@@ -672,12 +719,12 @@
         <w:tc>
           <w:tcPr>
             <w:tcW w:type="dxa" w:w="6192"/>
-            <w:shd w:fill="F4F6F9"/>
+            <w:shd w:fill="FFFFFF"/>
             <w:tcMar>
-              <w:top w:w="100" w:type="dxa"/>
-              <w:bottom w:w="100" w:type="dxa"/>
-              <w:left w:w="150" w:type="dxa"/>
-              <w:right w:w="150" w:type="dxa"/>
+              <w:top w:w="80" w:type="dxa"/>
+              <w:bottom w:w="80" w:type="dxa"/>
+              <w:left w:w="120" w:type="dxa"/>
+              <w:right w:w="120" w:type="dxa"/>
             </w:tcMar>
           </w:tcPr>
           <w:p>
@@ -685,7 +732,50 @@
               <w:rPr>
                 <w:sz w:val="19"/>
               </w:rPr>
-              <w:t>Official Google SDK to access the Gemini API for medical triage reasoning (replaces placeholder Claude integrations).</w:t>
+              <w:t>Gemini Integration</w:t>
+            </w:r>
+          </w:p>
+        </w:tc>
+      </w:tr>
+      <w:tr>
+        <w:tc>
+          <w:tcPr>
+            <w:tcW w:type="dxa" w:w="3168"/>
+            <w:shd w:fill="F4F6F9"/>
+            <w:tcMar>
+              <w:top w:w="80" w:type="dxa"/>
+              <w:bottom w:w="80" w:type="dxa"/>
+              <w:left w:w="120" w:type="dxa"/>
+              <w:right w:w="120" w:type="dxa"/>
+            </w:tcMar>
+          </w:tcPr>
+          <w:p>
+            <w:r>
+              <w:rPr>
+                <w:b/>
+                <w:sz w:val="19"/>
+              </w:rPr>
+              <w:t>Twilio</w:t>
+            </w:r>
+          </w:p>
+        </w:tc>
+        <w:tc>
+          <w:tcPr>
+            <w:tcW w:type="dxa" w:w="6192"/>
+            <w:shd w:fill="F4F6F9"/>
+            <w:tcMar>
+              <w:top w:w="80" w:type="dxa"/>
+              <w:bottom w:w="80" w:type="dxa"/>
+              <w:left w:w="120" w:type="dxa"/>
+              <w:right w:w="120" w:type="dxa"/>
+            </w:tcMar>
+          </w:tcPr>
+          <w:p>
+            <w:r>
+              <w:rPr>
+                <w:sz w:val="19"/>
+              </w:rPr>
+              <w:t>SMS Alerts</w:t>
             </w:r>
           </w:p>
         </w:tc>
@@ -696,225 +786,10 @@
             <w:tcW w:type="dxa" w:w="3168"/>
             <w:shd w:fill="FFFFFF"/>
             <w:tcMar>
-              <w:top w:w="100" w:type="dxa"/>
-              <w:bottom w:w="100" w:type="dxa"/>
-              <w:left w:w="150" w:type="dxa"/>
-              <w:right w:w="150" w:type="dxa"/>
-            </w:tcMar>
-          </w:tcPr>
-          <w:p>
-            <w:r>
-              <w:rPr>
-                <w:b/>
-                <w:sz w:val="19"/>
-              </w:rPr>
-              <w:t>twilio (9.1.0)</w:t>
-            </w:r>
-          </w:p>
-        </w:tc>
-        <w:tc>
-          <w:tcPr>
-            <w:tcW w:type="dxa" w:w="6192"/>
-            <w:shd w:fill="FFFFFF"/>
-            <w:tcMar>
-              <w:top w:w="100" w:type="dxa"/>
-              <w:bottom w:w="100" w:type="dxa"/>
-              <w:left w:w="150" w:type="dxa"/>
-              <w:right w:w="150" w:type="dxa"/>
-            </w:tcMar>
-          </w:tcPr>
-          <w:p>
-            <w:r>
-              <w:rPr>
-                <w:sz w:val="19"/>
-              </w:rPr>
-              <w:t>SMS gateway client used to immediately dispatch emergency notifications to contacts.</w:t>
-            </w:r>
-          </w:p>
-        </w:tc>
-      </w:tr>
-      <w:tr>
-        <w:tc>
-          <w:tcPr>
-            <w:tcW w:type="dxa" w:w="3168"/>
-            <w:shd w:fill="F4F6F9"/>
-            <w:tcMar>
-              <w:top w:w="100" w:type="dxa"/>
-              <w:bottom w:w="100" w:type="dxa"/>
-              <w:left w:w="150" w:type="dxa"/>
-              <w:right w:w="150" w:type="dxa"/>
-            </w:tcMar>
-          </w:tcPr>
-          <w:p>
-            <w:r>
-              <w:rPr>
-                <w:b/>
-                <w:sz w:val="19"/>
-              </w:rPr>
-              <w:t>cloudinary (1.40.0)</w:t>
-            </w:r>
-          </w:p>
-        </w:tc>
-        <w:tc>
-          <w:tcPr>
-            <w:tcW w:type="dxa" w:w="6192"/>
-            <w:shd w:fill="F4F6F9"/>
-            <w:tcMar>
-              <w:top w:w="100" w:type="dxa"/>
-              <w:bottom w:w="100" w:type="dxa"/>
-              <w:left w:w="150" w:type="dxa"/>
-              <w:right w:w="150" w:type="dxa"/>
-            </w:tcMar>
-          </w:tcPr>
-          <w:p>
-            <w:r>
-              <w:rPr>
-                <w:sz w:val="19"/>
-              </w:rPr>
-              <w:t>Cloud repository manager storing and hosting critical incident images and triage evidence.</w:t>
-            </w:r>
-          </w:p>
-        </w:tc>
-      </w:tr>
-      <w:tr>
-        <w:tc>
-          <w:tcPr>
-            <w:tcW w:type="dxa" w:w="3168"/>
-            <w:shd w:fill="FFFFFF"/>
-            <w:tcMar>
-              <w:top w:w="100" w:type="dxa"/>
-              <w:bottom w:w="100" w:type="dxa"/>
-              <w:left w:w="150" w:type="dxa"/>
-              <w:right w:w="150" w:type="dxa"/>
-            </w:tcMar>
-          </w:tcPr>
-          <w:p>
-            <w:r>
-              <w:rPr>
-                <w:b/>
-                <w:sz w:val="19"/>
-              </w:rPr>
-              <w:t>firebase-admin</w:t>
-            </w:r>
-          </w:p>
-        </w:tc>
-        <w:tc>
-          <w:tcPr>
-            <w:tcW w:type="dxa" w:w="6192"/>
-            <w:shd w:fill="FFFFFF"/>
-            <w:tcMar>
-              <w:top w:w="100" w:type="dxa"/>
-              <w:bottom w:w="100" w:type="dxa"/>
-              <w:left w:w="150" w:type="dxa"/>
-              <w:right w:w="150" w:type="dxa"/>
-            </w:tcMar>
-          </w:tcPr>
-          <w:p>
-            <w:r>
-              <w:rPr>
-                <w:sz w:val="19"/>
-              </w:rPr>
-              <w:t>Admin SDK to authenticate profile connections and push notification alerts to mobile agents.</w:t>
-            </w:r>
-          </w:p>
-        </w:tc>
-      </w:tr>
-      <w:tr>
-        <w:tc>
-          <w:tcPr>
-            <w:tcW w:type="dxa" w:w="3168"/>
-            <w:shd w:fill="F4F6F9"/>
-            <w:tcMar>
-              <w:top w:w="100" w:type="dxa"/>
-              <w:bottom w:w="100" w:type="dxa"/>
-              <w:left w:w="150" w:type="dxa"/>
-              <w:right w:w="150" w:type="dxa"/>
-            </w:tcMar>
-          </w:tcPr>
-          <w:p>
-            <w:r>
-              <w:rPr>
-                <w:b/>
-                <w:sz w:val="19"/>
-              </w:rPr>
-              <w:t>reportlab (4.1.0)</w:t>
-            </w:r>
-          </w:p>
-        </w:tc>
-        <w:tc>
-          <w:tcPr>
-            <w:tcW w:type="dxa" w:w="6192"/>
-            <w:shd w:fill="F4F6F9"/>
-            <w:tcMar>
-              <w:top w:w="100" w:type="dxa"/>
-              <w:bottom w:w="100" w:type="dxa"/>
-              <w:left w:w="150" w:type="dxa"/>
-              <w:right w:w="150" w:type="dxa"/>
-            </w:tcMar>
-          </w:tcPr>
-          <w:p>
-            <w:r>
-              <w:rPr>
-                <w:sz w:val="19"/>
-              </w:rPr>
-              <w:t>Compiles official first-aid summaries, PDF metrics, and emergency incidents logs.</w:t>
-            </w:r>
-          </w:p>
-        </w:tc>
-      </w:tr>
-      <w:tr>
-        <w:tc>
-          <w:tcPr>
-            <w:tcW w:type="dxa" w:w="3168"/>
-            <w:shd w:fill="FFFFFF"/>
-            <w:tcMar>
-              <w:top w:w="100" w:type="dxa"/>
-              <w:bottom w:w="100" w:type="dxa"/>
-              <w:left w:w="150" w:type="dxa"/>
-              <w:right w:w="150" w:type="dxa"/>
-            </w:tcMar>
-          </w:tcPr>
-          <w:p>
-            <w:r>
-              <w:rPr>
-                <w:b/>
-                <w:sz w:val="19"/>
-              </w:rPr>
-              <w:t>gTTS</w:t>
-            </w:r>
-          </w:p>
-        </w:tc>
-        <w:tc>
-          <w:tcPr>
-            <w:tcW w:type="dxa" w:w="6192"/>
-            <w:shd w:fill="FFFFFF"/>
-            <w:tcMar>
-              <w:top w:w="100" w:type="dxa"/>
-              <w:bottom w:w="100" w:type="dxa"/>
-              <w:left w:w="150" w:type="dxa"/>
-              <w:right w:w="150" w:type="dxa"/>
-            </w:tcMar>
-          </w:tcPr>
-          <w:p>
-            <w:r>
-              <w:rPr>
-                <w:sz w:val="19"/>
-              </w:rPr>
-              <w:t>Google Text-to-Speech library providing audio instructions for next-step first-aid actions.</w:t>
-            </w:r>
-          </w:p>
-        </w:tc>
-      </w:tr>
-      <w:tr>
-        <w:tc>
-          <w:tcPr>
-            <w:tcW w:type="dxa" w:w="3168"/>
-            <w:shd w:fill="F4F6F9"/>
-            <w:tcMar>
-              <w:top w:w="100" w:type="dxa"/>
-              <w:bottom w:w="100" w:type="dxa"/>
-              <w:left w:w="150" w:type="dxa"/>
-              <w:right w:w="150" w:type="dxa"/>
+              <w:top w:w="80" w:type="dxa"/>
+              <w:bottom w:w="80" w:type="dxa"/>
+              <w:left w:w="120" w:type="dxa"/>
+              <w:right w:w="120" w:type="dxa"/>
             </w:tcMar>
           </w:tcPr>
           <w:p>
@@ -930,12 +805,12 @@
         <w:tc>
           <w:tcPr>
             <w:tcW w:type="dxa" w:w="6192"/>
-            <w:shd w:fill="F4F6F9"/>
+            <w:shd w:fill="FFFFFF"/>
             <w:tcMar>
-              <w:top w:w="100" w:type="dxa"/>
-              <w:bottom w:w="100" w:type="dxa"/>
-              <w:left w:w="150" w:type="dxa"/>
-              <w:right w:w="150" w:type="dxa"/>
+              <w:top w:w="80" w:type="dxa"/>
+              <w:bottom w:w="80" w:type="dxa"/>
+              <w:left w:w="120" w:type="dxa"/>
+              <w:right w:w="120" w:type="dxa"/>
             </w:tcMar>
           </w:tcPr>
           <w:p>
@@ -943,7 +818,50 @@
               <w:rPr>
                 <w:sz w:val="19"/>
               </w:rPr>
-              <w:t>Provides spatial math coordinates utility to track distances and route medical dispatches.</w:t>
+              <w:t>Provides geographic calculations used for distance estimation and nearby service discovery.</w:t>
+            </w:r>
+          </w:p>
+        </w:tc>
+      </w:tr>
+      <w:tr>
+        <w:tc>
+          <w:tcPr>
+            <w:tcW w:type="dxa" w:w="3168"/>
+            <w:shd w:fill="F4F6F9"/>
+            <w:tcMar>
+              <w:top w:w="80" w:type="dxa"/>
+              <w:bottom w:w="80" w:type="dxa"/>
+              <w:left w:w="120" w:type="dxa"/>
+              <w:right w:w="120" w:type="dxa"/>
+            </w:tcMar>
+          </w:tcPr>
+          <w:p>
+            <w:r>
+              <w:rPr>
+                <w:b/>
+                <w:sz w:val="19"/>
+              </w:rPr>
+              <w:t>PyJWT</w:t>
+            </w:r>
+          </w:p>
+        </w:tc>
+        <w:tc>
+          <w:tcPr>
+            <w:tcW w:type="dxa" w:w="6192"/>
+            <w:shd w:fill="F4F6F9"/>
+            <w:tcMar>
+              <w:top w:w="80" w:type="dxa"/>
+              <w:bottom w:w="80" w:type="dxa"/>
+              <w:left w:w="120" w:type="dxa"/>
+              <w:right w:w="120" w:type="dxa"/>
+            </w:tcMar>
+          </w:tcPr>
+          <w:p>
+            <w:r>
+              <w:rPr>
+                <w:sz w:val="19"/>
+              </w:rPr>
+              <w:t>Authentication</w:t>
             </w:r>
           </w:p>
         </w:tc>
@@ -954,8 +872,84 @@
             <w:tcW w:type="dxa" w:w="3168"/>
             <w:shd w:fill="FFFFFF"/>
             <w:tcMar>
-              <w:top w:w="100" w:type="dxa"/>
-              <w:bottom w:w="100" w:type="dxa"/>
+              <w:top w:w="80" w:type="dxa"/>
+              <w:bottom w:w="80" w:type="dxa"/>
+              <w:left w:w="120" w:type="dxa"/>
+              <w:right w:w="120" w:type="dxa"/>
+            </w:tcMar>
+          </w:tcPr>
+          <w:p>
+            <w:r>
+              <w:rPr>
+                <w:b/>
+                <w:sz w:val="19"/>
+              </w:rPr>
+              <w:t>python-dotenv</w:t>
+            </w:r>
+          </w:p>
+        </w:tc>
+        <w:tc>
+          <w:tcPr>
+            <w:tcW w:type="dxa" w:w="6192"/>
+            <w:shd w:fill="FFFFFF"/>
+            <w:tcMar>
+              <w:top w:w="80" w:type="dxa"/>
+              <w:bottom w:w="80" w:type="dxa"/>
+              <w:left w:w="120" w:type="dxa"/>
+              <w:right w:w="120" w:type="dxa"/>
+            </w:tcMar>
+          </w:tcPr>
+          <w:p>
+            <w:r>
+              <w:rPr>
+                <w:sz w:val="19"/>
+              </w:rPr>
+              <w:t>Environment Variables</w:t>
+            </w:r>
+          </w:p>
+        </w:tc>
+      </w:tr>
+    </w:tbl>
+    <w:p>
+      <w:pPr>
+        <w:spacing w:before="240" w:after="80"/>
+      </w:pPr>
+      <w:r>
+        <w:rPr>
+          <w:b/>
+          <w:color w:val="4A777A"/>
+          <w:sz w:val="26"/>
+        </w:rPr>
+        <w:t>6.2 Frontend Packages</w:t>
+      </w:r>
+    </w:p>
+    <w:tbl>
+      <w:tblPr>
+        <w:tblW w:type="auto" w:w="0"/>
+        <w:jc w:val="center"/>
+        <w:tblLayout w:type="fixed"/>
+        <w:tblLook w:firstColumn="1" w:firstRow="1" w:lastColumn="0" w:lastRow="0" w:noHBand="0" w:noVBand="1" w:val="04A0"/>
+        <w:tblBorders>
+          <w:top w:val="single" w:sz="4" w:space="0" w:color="D3D3D3"/>
+          <w:bottom w:val="single" w:sz="4" w:space="0" w:color="D3D3D3"/>
+          <w:insideH w:val="single" w:sz="4" w:space="0" w:color="D3D3D3"/>
+          <w:left w:val="none"/>
+          <w:right w:val="none"/>
+          <w:insideV w:val="none"/>
+        </w:tblBorders>
+      </w:tblPr>
+      <w:tblGrid>
+        <w:gridCol w:w="4680"/>
+        <w:gridCol w:w="4680"/>
+      </w:tblGrid>
+      <w:tr>
+        <w:tc>
+          <w:tcPr>
+            <w:tcW w:type="dxa" w:w="3168"/>
+            <w:shd w:fill="4A777A"/>
+            <w:tcMar>
+              <w:top w:w="120" w:type="dxa"/>
+              <w:bottom w:w="120" w:type="dxa"/>
               <w:left w:w="150" w:type="dxa"/>
               <w:right w:w="150" w:type="dxa"/>
             </w:tcMar>
@@ -964,9 +958,55 @@
             <w:r>
               <w:rPr>
                 <w:b/>
+                <w:color w:val="FFFFFF"/>
+                <w:sz w:val="21"/>
+              </w:rPr>
+              <w:t>Package</w:t>
+            </w:r>
+          </w:p>
+        </w:tc>
+        <w:tc>
+          <w:tcPr>
+            <w:tcW w:type="dxa" w:w="6192"/>
+            <w:shd w:fill="4A777A"/>
+            <w:tcMar>
+              <w:top w:w="120" w:type="dxa"/>
+              <w:bottom w:w="120" w:type="dxa"/>
+              <w:left w:w="150" w:type="dxa"/>
+              <w:right w:w="150" w:type="dxa"/>
+            </w:tcMar>
+          </w:tcPr>
+          <w:p>
+            <w:r>
+              <w:rPr>
+                <w:b/>
+                <w:color w:val="FFFFFF"/>
+                <w:sz w:val="21"/>
+              </w:rPr>
+              <w:t>Purpose</w:t>
+            </w:r>
+          </w:p>
+        </w:tc>
+      </w:tr>
+      <w:tr>
+        <w:tc>
+          <w:tcPr>
+            <w:tcW w:type="dxa" w:w="3168"/>
+            <w:shd w:fill="FFFFFF"/>
+            <w:tcMar>
+              <w:top w:w="80" w:type="dxa"/>
+              <w:bottom w:w="80" w:type="dxa"/>
+              <w:left w:w="120" w:type="dxa"/>
+              <w:right w:w="120" w:type="dxa"/>
+            </w:tcMar>
+          </w:tcPr>
+          <w:p>
+            <w:r>
+              <w:rPr>
+                <w:b/>
                 <w:sz w:val="19"/>
               </w:rPr>
-              <w:t>PyJWT (2.8.0)</w:t>
+              <w:t>React</w:t>
             </w:r>
           </w:p>
         </w:tc>
@@ -975,10 +1015,10 @@
             <w:tcW w:type="dxa" w:w="6192"/>
             <w:shd w:fill="FFFFFF"/>
             <w:tcMar>
-              <w:top w:w="100" w:type="dxa"/>
-              <w:bottom w:w="100" w:type="dxa"/>
-              <w:left w:w="150" w:type="dxa"/>
-              <w:right w:w="150" w:type="dxa"/>
+              <w:top w:w="80" w:type="dxa"/>
+              <w:bottom w:w="80" w:type="dxa"/>
+              <w:left w:w="120" w:type="dxa"/>
+              <w:right w:w="120" w:type="dxa"/>
             </w:tcMar>
           </w:tcPr>
           <w:p>
@@ -986,7 +1026,7 @@
               <w:rPr>
                 <w:sz w:val="19"/>
               </w:rPr>
-              <w:t>JSON Web Tokens implementation for user session authorization and profile authentication.</w:t>
+              <w:t>UI</w:t>
             </w:r>
           </w:p>
         </w:tc>
@@ -997,10 +1037,10 @@
             <w:tcW w:type="dxa" w:w="3168"/>
             <w:shd w:fill="F4F6F9"/>
             <w:tcMar>
-              <w:top w:w="100" w:type="dxa"/>
-              <w:bottom w:w="100" w:type="dxa"/>
-              <w:left w:w="150" w:type="dxa"/>
-              <w:right w:w="150" w:type="dxa"/>
+              <w:top w:w="80" w:type="dxa"/>
+              <w:bottom w:w="80" w:type="dxa"/>
+              <w:left w:w="120" w:type="dxa"/>
+              <w:right w:w="120" w:type="dxa"/>
             </w:tcMar>
           </w:tcPr>
           <w:p>
@@ -1009,7 +1049,7 @@
                 <w:b/>
                 <w:sz w:val="19"/>
               </w:rPr>
-              <w:t>python-dotenv (1.0.1)</w:t>
+              <w:t>Vite</w:t>
             </w:r>
           </w:p>
         </w:tc>
@@ -1018,10 +1058,10 @@
             <w:tcW w:type="dxa" w:w="6192"/>
             <w:shd w:fill="F4F6F9"/>
             <w:tcMar>
-              <w:top w:w="100" w:type="dxa"/>
-              <w:bottom w:w="100" w:type="dxa"/>
-              <w:left w:w="150" w:type="dxa"/>
-              <w:right w:w="150" w:type="dxa"/>
+              <w:top w:w="80" w:type="dxa"/>
+              <w:bottom w:w="80" w:type="dxa"/>
+              <w:left w:w="120" w:type="dxa"/>
+              <w:right w:w="120" w:type="dxa"/>
             </w:tcMar>
           </w:tcPr>
           <w:p>
@@ -1029,7 +1069,93 @@
               <w:rPr>
                 <w:sz w:val="19"/>
               </w:rPr>
-              <w:t>Safe variable extraction to manage secret keys, cloud tokens, and system addresses.</w:t>
+              <w:t>Build Tool</w:t>
+            </w:r>
+          </w:p>
+        </w:tc>
+      </w:tr>
+      <w:tr>
+        <w:tc>
+          <w:tcPr>
+            <w:tcW w:type="dxa" w:w="3168"/>
+            <w:shd w:fill="FFFFFF"/>
+            <w:tcMar>
+              <w:top w:w="80" w:type="dxa"/>
+              <w:bottom w:w="80" w:type="dxa"/>
+              <w:left w:w="120" w:type="dxa"/>
+              <w:right w:w="120" w:type="dxa"/>
+            </w:tcMar>
+          </w:tcPr>
+          <w:p>
+            <w:r>
+              <w:rPr>
+                <w:b/>
+                <w:sz w:val="19"/>
+              </w:rPr>
+              <w:t>React Router</w:t>
+            </w:r>
+          </w:p>
+        </w:tc>
+        <w:tc>
+          <w:tcPr>
+            <w:tcW w:type="dxa" w:w="6192"/>
+            <w:shd w:fill="FFFFFF"/>
+            <w:tcMar>
+              <w:top w:w="80" w:type="dxa"/>
+              <w:bottom w:w="80" w:type="dxa"/>
+              <w:left w:w="120" w:type="dxa"/>
+              <w:right w:w="120" w:type="dxa"/>
+            </w:tcMar>
+          </w:tcPr>
+          <w:p>
+            <w:r>
+              <w:rPr>
+                <w:sz w:val="19"/>
+              </w:rPr>
+              <w:t>Routing</w:t>
+            </w:r>
+          </w:p>
+        </w:tc>
+      </w:tr>
+      <w:tr>
+        <w:tc>
+          <w:tcPr>
+            <w:tcW w:type="dxa" w:w="3168"/>
+            <w:shd w:fill="F4F6F9"/>
+            <w:tcMar>
+              <w:top w:w="80" w:type="dxa"/>
+              <w:bottom w:w="80" w:type="dxa"/>
+              <w:left w:w="120" w:type="dxa"/>
+              <w:right w:w="120" w:type="dxa"/>
+            </w:tcMar>
+          </w:tcPr>
+          <w:p>
+            <w:r>
+              <w:rPr>
+                <w:b/>
+                <w:sz w:val="19"/>
+              </w:rPr>
+              <w:t>Tailwind CSS</w:t>
+            </w:r>
+          </w:p>
+        </w:tc>
+        <w:tc>
+          <w:tcPr>
+            <w:tcW w:type="dxa" w:w="6192"/>
+            <w:shd w:fill="F4F6F9"/>
+            <w:tcMar>
+              <w:top w:w="80" w:type="dxa"/>
+              <w:bottom w:w="80" w:type="dxa"/>
+              <w:left w:w="120" w:type="dxa"/>
+              <w:right w:w="120" w:type="dxa"/>
+            </w:tcMar>
+          </w:tcPr>
+          <w:p>
+            <w:r>
+              <w:rPr>
+                <w:sz w:val="19"/>
+              </w:rPr>
+              <w:t>Styling</w:t>
             </w:r>
           </w:p>
         </w:tc>
@@ -1045,7 +1171,7 @@
           <w:color w:val="1B365D"/>
           <w:sz w:val="32"/>
         </w:rPr>
-        <w:t>6. Key System Assumptions</w:t>
+        <w:t>7. Key System Assumptions</w:t>
       </w:r>
     </w:p>
     <w:p>

</xml_diff>

<commit_message>
docs: improve package version tags, technology layers and description accuracy
</commit_message>
<xml_diff>
--- a/RoadSOS_Hackathon_Details.docx
+++ b/RoadSOS_Hackathon_Details.docx
@@ -56,7 +56,7 @@
         <w:spacing w:line="276" w:lineRule="auto" w:after="240"/>
       </w:pPr>
       <w:r>
-        <w:t>RoadSOS is an AI-powered emergency assistance platform designed to connect individuals in critical roadside situations with immediate life-saving help. At its core, the platform integrates location-based emergency services discovery, real-time AI injury triage using the Google Gemini API, instant first-aid guidance, and automated SOS assistance. By leveraging the user's Geolocation API and Google Maps API, RoadSOS helps users discover, route to, and contact nearby trauma centers, active ambulance services, local police stations, and rapid rescue teams. The application is built using a decoupled, highly secure architecture that runs efficiently across both web and mobile environments.</w:t>
+        <w:t>RoadSOS is an AI-powered emergency assistance platform designed to connect individuals in critical roadside situations with immediate life-saving help. At its core, the platform integrates location-based emergency services discovery, real-time AI injury triage using the Google Gemini API, instant first-aid guidance, and automated SOS assistance. By leveraging the user's Geolocation API and Google Maps API, RoadSOS helps users discover, route to, and contact nearby trauma centers, active ambulance services, local police stations, and rapid rescue teams. The application follows a modular architecture designed for scalability and accessibility across modern web and mobile browsers.</w:t>
       </w:r>
     </w:p>
     <w:p>
@@ -356,6 +356,22 @@
     </w:p>
     <w:p>
       <w:pPr>
+        <w:pStyle w:val="ListBullet"/>
+        <w:spacing w:after="80"/>
+      </w:pPr>
+      <w:r>
+        <w:rPr>
+          <w:b/>
+          <w:color w:val="4A777A"/>
+        </w:rPr>
+        <w:t xml:space="preserve">Location Services: </w:t>
+      </w:r>
+      <w:r>
+        <w:t>Google Maps Platform and HTML5 Geolocation API for spatial service discovery, distance mapping, and routing calculations.</w:t>
+      </w:r>
+    </w:p>
+    <w:p>
+      <w:pPr>
         <w:spacing w:before="280" w:after="120"/>
       </w:pPr>
       <w:r>
@@ -540,7 +556,7 @@
                 <w:b/>
                 <w:sz w:val="19"/>
               </w:rPr>
-              <w:t>FastAPI</w:t>
+              <w:t>FastAPI (0.111.0)</w:t>
             </w:r>
           </w:p>
         </w:tc>
@@ -583,7 +599,7 @@
                 <w:b/>
                 <w:sz w:val="19"/>
               </w:rPr>
-              <w:t>Uvicorn</w:t>
+              <w:t>Uvicorn (0.29.0)</w:t>
             </w:r>
           </w:p>
         </w:tc>
@@ -626,7 +642,7 @@
                 <w:b/>
                 <w:sz w:val="19"/>
               </w:rPr>
-              <w:t>SQLAlchemy</w:t>
+              <w:t>SQLAlchemy (2.x)</w:t>
             </w:r>
           </w:p>
         </w:tc>
@@ -841,7 +857,7 @@
                 <w:b/>
                 <w:sz w:val="19"/>
               </w:rPr>
-              <w:t>PyJWT</w:t>
+              <w:t>PyJWT (2.8.0)</w:t>
             </w:r>
           </w:p>
         </w:tc>
@@ -884,7 +900,7 @@
                 <w:b/>
                 <w:sz w:val="19"/>
               </w:rPr>
-              <w:t>python-dotenv</w:t>
+              <w:t>python-dotenv (1.0.1)</w:t>
             </w:r>
           </w:p>
         </w:tc>

</xml_diff>

<commit_message>
docs: add premium technology stack summary mapping table
</commit_message>
<xml_diff>
--- a/RoadSOS_Hackathon_Details.docx
+++ b/RoadSOS_Hackathon_Details.docx
@@ -372,7 +372,379 @@
     </w:p>
     <w:p>
       <w:pPr>
-        <w:spacing w:before="280" w:after="120"/>
+        <w:spacing w:after="80"/>
+      </w:pPr>
+    </w:p>
+    <w:tbl>
+      <w:tblPr>
+        <w:tblW w:type="auto" w:w="0"/>
+        <w:jc w:val="center"/>
+        <w:tblLayout w:type="fixed"/>
+        <w:tblLook w:firstColumn="1" w:firstRow="1" w:lastColumn="0" w:lastRow="0" w:noHBand="0" w:noVBand="1" w:val="04A0"/>
+        <w:tblBorders>
+          <w:top w:val="single" w:sz="4" w:space="0" w:color="D3D3D3"/>
+          <w:bottom w:val="single" w:sz="4" w:space="0" w:color="D3D3D3"/>
+          <w:insideH w:val="single" w:sz="4" w:space="0" w:color="D3D3D3"/>
+          <w:left w:val="none"/>
+          <w:right w:val="none"/>
+          <w:insideV w:val="none"/>
+        </w:tblBorders>
+      </w:tblPr>
+      <w:tblGrid>
+        <w:gridCol w:w="4680"/>
+        <w:gridCol w:w="4680"/>
+      </w:tblGrid>
+      <w:tr>
+        <w:tc>
+          <w:tcPr>
+            <w:tcW w:type="dxa" w:w="3168"/>
+            <w:shd w:fill="4A777A"/>
+            <w:tcMar>
+              <w:top w:w="120" w:type="dxa"/>
+              <w:bottom w:w="120" w:type="dxa"/>
+              <w:left w:w="150" w:type="dxa"/>
+              <w:right w:w="150" w:type="dxa"/>
+            </w:tcMar>
+          </w:tcPr>
+          <w:p>
+            <w:r>
+              <w:rPr>
+                <w:b/>
+                <w:color w:val="FFFFFF"/>
+                <w:sz w:val="21"/>
+              </w:rPr>
+              <w:t>Layer</w:t>
+            </w:r>
+          </w:p>
+        </w:tc>
+        <w:tc>
+          <w:tcPr>
+            <w:tcW w:type="dxa" w:w="6192"/>
+            <w:shd w:fill="4A777A"/>
+            <w:tcMar>
+              <w:top w:w="120" w:type="dxa"/>
+              <w:bottom w:w="120" w:type="dxa"/>
+              <w:left w:w="150" w:type="dxa"/>
+              <w:right w:w="150" w:type="dxa"/>
+            </w:tcMar>
+          </w:tcPr>
+          <w:p>
+            <w:r>
+              <w:rPr>
+                <w:b/>
+                <w:color w:val="FFFFFF"/>
+                <w:sz w:val="21"/>
+              </w:rPr>
+              <w:t>Technologies</w:t>
+            </w:r>
+          </w:p>
+        </w:tc>
+      </w:tr>
+      <w:tr>
+        <w:tc>
+          <w:tcPr>
+            <w:tcW w:type="dxa" w:w="3168"/>
+            <w:shd w:fill="FFFFFF"/>
+            <w:tcMar>
+              <w:top w:w="80" w:type="dxa"/>
+              <w:bottom w:w="80" w:type="dxa"/>
+              <w:left w:w="120" w:type="dxa"/>
+              <w:right w:w="120" w:type="dxa"/>
+            </w:tcMar>
+          </w:tcPr>
+          <w:p>
+            <w:r>
+              <w:rPr>
+                <w:b/>
+                <w:sz w:val="19"/>
+              </w:rPr>
+              <w:t>Frontend</w:t>
+            </w:r>
+          </w:p>
+        </w:tc>
+        <w:tc>
+          <w:tcPr>
+            <w:tcW w:type="dxa" w:w="6192"/>
+            <w:shd w:fill="FFFFFF"/>
+            <w:tcMar>
+              <w:top w:w="80" w:type="dxa"/>
+              <w:bottom w:w="80" w:type="dxa"/>
+              <w:left w:w="120" w:type="dxa"/>
+              <w:right w:w="120" w:type="dxa"/>
+            </w:tcMar>
+          </w:tcPr>
+          <w:p>
+            <w:r>
+              <w:rPr>
+                <w:sz w:val="19"/>
+              </w:rPr>
+              <w:t>React, Vite, Tailwind CSS</w:t>
+            </w:r>
+          </w:p>
+        </w:tc>
+      </w:tr>
+      <w:tr>
+        <w:tc>
+          <w:tcPr>
+            <w:tcW w:type="dxa" w:w="3168"/>
+            <w:shd w:fill="F4F6F9"/>
+            <w:tcMar>
+              <w:top w:w="80" w:type="dxa"/>
+              <w:bottom w:w="80" w:type="dxa"/>
+              <w:left w:w="120" w:type="dxa"/>
+              <w:right w:w="120" w:type="dxa"/>
+            </w:tcMar>
+          </w:tcPr>
+          <w:p>
+            <w:r>
+              <w:rPr>
+                <w:b/>
+                <w:sz w:val="19"/>
+              </w:rPr>
+              <w:t>Backend</w:t>
+            </w:r>
+          </w:p>
+        </w:tc>
+        <w:tc>
+          <w:tcPr>
+            <w:tcW w:type="dxa" w:w="6192"/>
+            <w:shd w:fill="F4F6F9"/>
+            <w:tcMar>
+              <w:top w:w="80" w:type="dxa"/>
+              <w:bottom w:w="80" w:type="dxa"/>
+              <w:left w:w="120" w:type="dxa"/>
+              <w:right w:w="120" w:type="dxa"/>
+            </w:tcMar>
+          </w:tcPr>
+          <w:p>
+            <w:r>
+              <w:rPr>
+                <w:sz w:val="19"/>
+              </w:rPr>
+              <w:t>FastAPI, Uvicorn</w:t>
+            </w:r>
+          </w:p>
+        </w:tc>
+      </w:tr>
+      <w:tr>
+        <w:tc>
+          <w:tcPr>
+            <w:tcW w:type="dxa" w:w="3168"/>
+            <w:shd w:fill="FFFFFF"/>
+            <w:tcMar>
+              <w:top w:w="80" w:type="dxa"/>
+              <w:bottom w:w="80" w:type="dxa"/>
+              <w:left w:w="120" w:type="dxa"/>
+              <w:right w:w="120" w:type="dxa"/>
+            </w:tcMar>
+          </w:tcPr>
+          <w:p>
+            <w:r>
+              <w:rPr>
+                <w:b/>
+                <w:sz w:val="19"/>
+              </w:rPr>
+              <w:t>Database</w:t>
+            </w:r>
+          </w:p>
+        </w:tc>
+        <w:tc>
+          <w:tcPr>
+            <w:tcW w:type="dxa" w:w="6192"/>
+            <w:shd w:fill="FFFFFF"/>
+            <w:tcMar>
+              <w:top w:w="80" w:type="dxa"/>
+              <w:bottom w:w="80" w:type="dxa"/>
+              <w:left w:w="120" w:type="dxa"/>
+              <w:right w:w="120" w:type="dxa"/>
+            </w:tcMar>
+          </w:tcPr>
+          <w:p>
+            <w:r>
+              <w:rPr>
+                <w:sz w:val="19"/>
+              </w:rPr>
+              <w:t>SQLite, SQLAlchemy</w:t>
+            </w:r>
+          </w:p>
+        </w:tc>
+      </w:tr>
+      <w:tr>
+        <w:tc>
+          <w:tcPr>
+            <w:tcW w:type="dxa" w:w="3168"/>
+            <w:shd w:fill="F4F6F9"/>
+            <w:tcMar>
+              <w:top w:w="80" w:type="dxa"/>
+              <w:bottom w:w="80" w:type="dxa"/>
+              <w:left w:w="120" w:type="dxa"/>
+              <w:right w:w="120" w:type="dxa"/>
+            </w:tcMar>
+          </w:tcPr>
+          <w:p>
+            <w:r>
+              <w:rPr>
+                <w:b/>
+                <w:sz w:val="19"/>
+              </w:rPr>
+              <w:t>AI</w:t>
+            </w:r>
+          </w:p>
+        </w:tc>
+        <w:tc>
+          <w:tcPr>
+            <w:tcW w:type="dxa" w:w="6192"/>
+            <w:shd w:fill="F4F6F9"/>
+            <w:tcMar>
+              <w:top w:w="80" w:type="dxa"/>
+              <w:bottom w:w="80" w:type="dxa"/>
+              <w:left w:w="120" w:type="dxa"/>
+              <w:right w:w="120" w:type="dxa"/>
+            </w:tcMar>
+          </w:tcPr>
+          <w:p>
+            <w:r>
+              <w:rPr>
+                <w:sz w:val="19"/>
+              </w:rPr>
+              <w:t>Google Gemini</w:t>
+            </w:r>
+          </w:p>
+        </w:tc>
+      </w:tr>
+      <w:tr>
+        <w:tc>
+          <w:tcPr>
+            <w:tcW w:type="dxa" w:w="3168"/>
+            <w:shd w:fill="FFFFFF"/>
+            <w:tcMar>
+              <w:top w:w="80" w:type="dxa"/>
+              <w:bottom w:w="80" w:type="dxa"/>
+              <w:left w:w="120" w:type="dxa"/>
+              <w:right w:w="120" w:type="dxa"/>
+            </w:tcMar>
+          </w:tcPr>
+          <w:p>
+            <w:r>
+              <w:rPr>
+                <w:b/>
+                <w:sz w:val="19"/>
+              </w:rPr>
+              <w:t>Location</w:t>
+            </w:r>
+          </w:p>
+        </w:tc>
+        <w:tc>
+          <w:tcPr>
+            <w:tcW w:type="dxa" w:w="6192"/>
+            <w:shd w:fill="FFFFFF"/>
+            <w:tcMar>
+              <w:top w:w="80" w:type="dxa"/>
+              <w:bottom w:w="80" w:type="dxa"/>
+              <w:left w:w="120" w:type="dxa"/>
+              <w:right w:w="120" w:type="dxa"/>
+            </w:tcMar>
+          </w:tcPr>
+          <w:p>
+            <w:r>
+              <w:rPr>
+                <w:sz w:val="19"/>
+              </w:rPr>
+              <w:t>Google Maps API, Geolocation API</w:t>
+            </w:r>
+          </w:p>
+        </w:tc>
+      </w:tr>
+      <w:tr>
+        <w:tc>
+          <w:tcPr>
+            <w:tcW w:type="dxa" w:w="3168"/>
+            <w:shd w:fill="F4F6F9"/>
+            <w:tcMar>
+              <w:top w:w="80" w:type="dxa"/>
+              <w:bottom w:w="80" w:type="dxa"/>
+              <w:left w:w="120" w:type="dxa"/>
+              <w:right w:w="120" w:type="dxa"/>
+            </w:tcMar>
+          </w:tcPr>
+          <w:p>
+            <w:r>
+              <w:rPr>
+                <w:b/>
+                <w:sz w:val="19"/>
+              </w:rPr>
+              <w:t>Communication</w:t>
+            </w:r>
+          </w:p>
+        </w:tc>
+        <w:tc>
+          <w:tcPr>
+            <w:tcW w:type="dxa" w:w="6192"/>
+            <w:shd w:fill="F4F6F9"/>
+            <w:tcMar>
+              <w:top w:w="80" w:type="dxa"/>
+              <w:bottom w:w="80" w:type="dxa"/>
+              <w:left w:w="120" w:type="dxa"/>
+              <w:right w:w="120" w:type="dxa"/>
+            </w:tcMar>
+          </w:tcPr>
+          <w:p>
+            <w:r>
+              <w:rPr>
+                <w:sz w:val="19"/>
+              </w:rPr>
+              <w:t>Twilio</w:t>
+            </w:r>
+          </w:p>
+        </w:tc>
+      </w:tr>
+      <w:tr>
+        <w:tc>
+          <w:tcPr>
+            <w:tcW w:type="dxa" w:w="3168"/>
+            <w:shd w:fill="FFFFFF"/>
+            <w:tcMar>
+              <w:top w:w="80" w:type="dxa"/>
+              <w:bottom w:w="80" w:type="dxa"/>
+              <w:left w:w="120" w:type="dxa"/>
+              <w:right w:w="120" w:type="dxa"/>
+            </w:tcMar>
+          </w:tcPr>
+          <w:p>
+            <w:r>
+              <w:rPr>
+                <w:b/>
+                <w:sz w:val="19"/>
+              </w:rPr>
+              <w:t>Deployment</w:t>
+            </w:r>
+          </w:p>
+        </w:tc>
+        <w:tc>
+          <w:tcPr>
+            <w:tcW w:type="dxa" w:w="6192"/>
+            <w:shd w:fill="FFFFFF"/>
+            <w:tcMar>
+              <w:top w:w="80" w:type="dxa"/>
+              <w:bottom w:w="80" w:type="dxa"/>
+              <w:left w:w="120" w:type="dxa"/>
+              <w:right w:w="120" w:type="dxa"/>
+            </w:tcMar>
+          </w:tcPr>
+          <w:p>
+            <w:r>
+              <w:rPr>
+                <w:sz w:val="19"/>
+              </w:rPr>
+              <w:t>Vercel, Docker</w:t>
+            </w:r>
+          </w:p>
+        </w:tc>
+      </w:tr>
+    </w:tbl>
+    <w:p>
+      <w:pPr>
+        <w:spacing w:before="360" w:after="120"/>
       </w:pPr>
       <w:r>
         <w:rPr>

</xml_diff>